<commit_message>
Add skills, workforce, quality, CRM, and ecosystem chapters.
The lab now has 23 tracks and 161 lessons. New pages cite only public sources that opened, and confirm notes stay unlinked.

Co-authored-by: CYPHER0X9 <cipher0x9@users.noreply.github.com>
</commit_message>
<xml_diff>
--- a/downloads/sections/home-tracks.docx
+++ b/downloads/sections/home-tracks.docx
@@ -99,6 +99,31 @@
     </w:p>
     <w:p>
       <w:r>
+        <w:t>Skills routing and ACD</w:t>
+      </w:r>
+    </w:p>
+    <w:p>
+      <w:r>
+        <w:t>Workforce management</w:t>
+      </w:r>
+    </w:p>
+    <w:p>
+      <w:r>
+        <w:t>Quality management and analytics</w:t>
+      </w:r>
+    </w:p>
+    <w:p>
+      <w:r>
+        <w:t>CRM and CTI integrations</w:t>
+      </w:r>
+    </w:p>
+    <w:p>
+      <w:r>
+        <w:t>Ecosystem</w:t>
+      </w:r>
+    </w:p>
+    <w:p>
+      <w:r>
         <w:t>Sources and go deeper</w:t>
       </w:r>
     </w:p>

</xml_diff>

<commit_message>
Add skills, workforce, quality, CRM, and ecosystem chapters. (#8)
The lab now has 23 tracks and 161 lessons. New pages cite only public sources that opened, and confirm notes stay unlinked.

Co-authored-by: Cursor Agent <cursoragent@cursor.com>
Co-authored-by: CYPHER0X9 <cipher0x9@users.noreply.github.com>
</commit_message>
<xml_diff>
--- a/downloads/sections/home-tracks.docx
+++ b/downloads/sections/home-tracks.docx
@@ -99,6 +99,31 @@
     </w:p>
     <w:p>
       <w:r>
+        <w:t>Skills routing and ACD</w:t>
+      </w:r>
+    </w:p>
+    <w:p>
+      <w:r>
+        <w:t>Workforce management</w:t>
+      </w:r>
+    </w:p>
+    <w:p>
+      <w:r>
+        <w:t>Quality management and analytics</w:t>
+      </w:r>
+    </w:p>
+    <w:p>
+      <w:r>
+        <w:t>CRM and CTI integrations</w:t>
+      </w:r>
+    </w:p>
+    <w:p>
+      <w:r>
+        <w:t>Ecosystem</w:t>
+      </w:r>
+    </w:p>
+    <w:p>
+      <w:r>
         <w:t>Sources and go deeper</w:t>
       </w:r>
     </w:p>

</xml_diff>